<commit_message>
Rechazar conexiones locales no previstas en pg_hba.conf y quitar EXECUTE a PUBLIC en funciones SECURITY DEFINER
</commit_message>
<xml_diff>
--- a/docs/Documentacion_Proyecto2.docx
+++ b/docs/Documentacion_Proyecto2.docx
@@ -7317,6 +7317,23 @@
           <w:szCs w:val="17"/>
         </w:rPr>
         <w:t xml:space="preserve">host    all         postgres          all        scram-sha-256</w:t>
+      </w:r>
+    </w:p>
+    <w:p>
+      <w:pPr>
+        <w:keepNext/>
+        <w:keepLines/>
+        <w:shd w:fill="F2F2F2" w:color="auto" w:val="clear"/>
+        <w:spacing w:before="0" w:after="0" w:line="228"/>
+        <w:ind w:left="360" w:right="120"/>
+      </w:pPr>
+      <w:r>
+        <w:rPr>
+          <w:rFonts w:ascii="Courier New" w:cs="Courier New" w:eastAsia="Courier New" w:hAnsi="Courier New"/>
+          <w:sz w:val="17"/>
+          <w:szCs w:val="17"/>
+        </w:rPr>
+        <w:t xml:space="preserve">local   all         all                          reject</w:t>
       </w:r>
     </w:p>
     <w:p>

</xml_diff>